<commit_message>
power bi visualization part one
</commit_message>
<xml_diff>
--- a/POWER BI/BANK LOAN REPORT powerbi/BANK LOAN PROBLEM STATEMENT.docx
+++ b/POWER BI/BANK LOAN REPORT powerbi/BANK LOAN PROBLEM STATEMENT.docx
@@ -111,17 +111,20 @@
           <w:highlight w:val="green"/>
           <w:u w:val="single"/>
         </w:rPr>
-        <w:t>(Good Loans and Bad Loans</w:t>
-      </w:r>
-      <w:r>
-        <w:rPr>
-          <w:b/>
-          <w:sz w:val="24"/>
-          <w:szCs w:val="24"/>
+        <w:t xml:space="preserve">(Good Loans and Bad </w:t>
+      </w:r>
+      <w:r>
+        <w:rPr>
+          <w:b/>
+          <w:sz w:val="24"/>
+          <w:szCs w:val="24"/>
+          <w:highlight w:val="green"/>
           <w:u w:val="single"/>
         </w:rPr>
-        <w:t>)</w:t>
-      </w:r>
+        <w:t>Loans)</w:t>
+      </w:r>
+      <w:bookmarkStart w:id="0" w:name="_GoBack"/>
+      <w:bookmarkEnd w:id="0"/>
     </w:p>
     <w:p>
       <w:pPr>
@@ -267,8 +270,6 @@
         </w:rPr>
         <w:t>Average Deb</w:t>
       </w:r>
-      <w:bookmarkStart w:id="0" w:name="_GoBack"/>
-      <w:bookmarkEnd w:id="0"/>
       <w:r>
         <w:rPr>
           <w:b/>

</xml_diff>